<commit_message>
fix: align final manuscript with frozen tier and manifest definitions
</commit_message>
<xml_diff>
--- a/paper/CXT-Fish_IMTS_Supplementary_Material_v2.docx
+++ b/paper/CXT-Fish_IMTS_Supplementary_Material_v2.docx
@@ -1704,6 +1704,337 @@
         <w:t>Table S2. Recorded-group counts in the three frozen outer-test manifests. There are 48 fold × species strata; the minimum is 5 and the maximum is 1414. These finite clusters motivate cautious interpretation of percentile cluster intervals for sparsely represented strata.</w:t>
       </w:r>
     </w:p>
+    <w:tbl>
+      <w:tblPr>
+        <w:tblStyle w:val="TableGrid"/>
+        <w:tblW w:type="auto" w:w="0"/>
+        <w:jc w:val="center"/>
+        <w:tblLook w:firstColumn="1" w:firstRow="1" w:lastColumn="0" w:lastRow="0" w:noHBand="0" w:noVBand="1" w:val="04A0"/>
+      </w:tblPr>
+      <w:tblGrid>
+        <w:gridCol w:w="2592"/>
+        <w:gridCol w:w="2592"/>
+        <w:gridCol w:w="2592"/>
+        <w:gridCol w:w="2592"/>
+      </w:tblGrid>
+      <w:tr>
+        <w:tc>
+          <w:tcPr>
+            <w:tcW w:type="dxa" w:w="1440"/>
+            <w:vAlign w:val="center"/>
+          </w:tcPr>
+          <w:p>
+            <w:pPr>
+              <w:spacing w:before="0" w:after="0" w:line="240" w:lineRule="auto"/>
+            </w:pPr>
+            <w:r/>
+            <w:r>
+              <w:rPr>
+                <w:b/>
+                <w:sz w:val="14"/>
+              </w:rPr>
+              <w:t>Outer fold</w:t>
+            </w:r>
+          </w:p>
+        </w:tc>
+        <w:tc>
+          <w:tcPr>
+            <w:tcW w:type="dxa" w:w="2880"/>
+            <w:vAlign w:val="center"/>
+          </w:tcPr>
+          <w:p>
+            <w:pPr>
+              <w:spacing w:before="0" w:after="0" w:line="240" w:lineRule="auto"/>
+            </w:pPr>
+            <w:r/>
+            <w:r>
+              <w:rPr>
+                <w:b/>
+                <w:sz w:val="14"/>
+              </w:rPr>
+              <w:t>Head species</w:t>
+            </w:r>
+          </w:p>
+        </w:tc>
+        <w:tc>
+          <w:tcPr>
+            <w:tcW w:type="dxa" w:w="2880"/>
+            <w:vAlign w:val="center"/>
+          </w:tcPr>
+          <w:p>
+            <w:pPr>
+              <w:spacing w:before="0" w:after="0" w:line="240" w:lineRule="auto"/>
+            </w:pPr>
+            <w:r/>
+            <w:r>
+              <w:rPr>
+                <w:b/>
+                <w:sz w:val="14"/>
+              </w:rPr>
+              <w:t>Mid species</w:t>
+            </w:r>
+          </w:p>
+        </w:tc>
+        <w:tc>
+          <w:tcPr>
+            <w:tcW w:type="dxa" w:w="2880"/>
+            <w:vAlign w:val="center"/>
+          </w:tcPr>
+          <w:p>
+            <w:pPr>
+              <w:spacing w:before="0" w:after="0" w:line="240" w:lineRule="auto"/>
+            </w:pPr>
+            <w:r/>
+            <w:r>
+              <w:rPr>
+                <w:b/>
+                <w:sz w:val="14"/>
+              </w:rPr>
+              <w:t>Tail species</w:t>
+            </w:r>
+          </w:p>
+        </w:tc>
+      </w:tr>
+      <w:tr>
+        <w:tc>
+          <w:tcPr>
+            <w:tcW w:type="dxa" w:w="1440"/>
+            <w:vAlign w:val="center"/>
+          </w:tcPr>
+          <w:p>
+            <w:pPr>
+              <w:spacing w:before="0" w:after="0" w:line="240" w:lineRule="auto"/>
+            </w:pPr>
+            <w:r/>
+            <w:r>
+              <w:rPr>
+                <w:b w:val="0"/>
+                <w:sz w:val="14"/>
+              </w:rPr>
+              <w:t>1</w:t>
+            </w:r>
+          </w:p>
+        </w:tc>
+        <w:tc>
+          <w:tcPr>
+            <w:tcW w:type="dxa" w:w="2880"/>
+            <w:vAlign w:val="center"/>
+          </w:tcPr>
+          <w:p>
+            <w:pPr>
+              <w:spacing w:before="0" w:after="0" w:line="240" w:lineRule="auto"/>
+            </w:pPr>
+            <w:r/>
+            <w:r>
+              <w:rPr>
+                <w:b w:val="0"/>
+                <w:sz w:val="14"/>
+              </w:rPr>
+              <w:t>1, 2, 3, 4, 5, 7</w:t>
+            </w:r>
+          </w:p>
+        </w:tc>
+        <w:tc>
+          <w:tcPr>
+            <w:tcW w:type="dxa" w:w="2880"/>
+            <w:vAlign w:val="center"/>
+          </w:tcPr>
+          <w:p>
+            <w:pPr>
+              <w:spacing w:before="0" w:after="0" w:line="240" w:lineRule="auto"/>
+            </w:pPr>
+            <w:r/>
+            <w:r>
+              <w:rPr>
+                <w:b w:val="0"/>
+                <w:sz w:val="14"/>
+              </w:rPr>
+              <w:t>6, 8, 9, 10, 13</w:t>
+            </w:r>
+          </w:p>
+        </w:tc>
+        <w:tc>
+          <w:tcPr>
+            <w:tcW w:type="dxa" w:w="2880"/>
+            <w:vAlign w:val="center"/>
+          </w:tcPr>
+          <w:p>
+            <w:pPr>
+              <w:spacing w:before="0" w:after="0" w:line="240" w:lineRule="auto"/>
+            </w:pPr>
+            <w:r/>
+            <w:r>
+              <w:rPr>
+                <w:b w:val="0"/>
+                <w:sz w:val="14"/>
+              </w:rPr>
+              <w:t>11, 12, 14, 15, 16</w:t>
+            </w:r>
+          </w:p>
+        </w:tc>
+      </w:tr>
+      <w:tr>
+        <w:tc>
+          <w:tcPr>
+            <w:tcW w:type="dxa" w:w="1440"/>
+            <w:vAlign w:val="center"/>
+          </w:tcPr>
+          <w:p>
+            <w:pPr>
+              <w:spacing w:before="0" w:after="0" w:line="240" w:lineRule="auto"/>
+            </w:pPr>
+            <w:r/>
+            <w:r>
+              <w:rPr>
+                <w:b w:val="0"/>
+                <w:sz w:val="14"/>
+              </w:rPr>
+              <w:t>2</w:t>
+            </w:r>
+          </w:p>
+        </w:tc>
+        <w:tc>
+          <w:tcPr>
+            <w:tcW w:type="dxa" w:w="2880"/>
+            <w:vAlign w:val="center"/>
+          </w:tcPr>
+          <w:p>
+            <w:pPr>
+              <w:spacing w:before="0" w:after="0" w:line="240" w:lineRule="auto"/>
+            </w:pPr>
+            <w:r/>
+            <w:r>
+              <w:rPr>
+                <w:b w:val="0"/>
+                <w:sz w:val="14"/>
+              </w:rPr>
+              <w:t>1, 2, 3, 4, 5, 7</w:t>
+            </w:r>
+          </w:p>
+        </w:tc>
+        <w:tc>
+          <w:tcPr>
+            <w:tcW w:type="dxa" w:w="2880"/>
+            <w:vAlign w:val="center"/>
+          </w:tcPr>
+          <w:p>
+            <w:pPr>
+              <w:spacing w:before="0" w:after="0" w:line="240" w:lineRule="auto"/>
+            </w:pPr>
+            <w:r/>
+            <w:r>
+              <w:rPr>
+                <w:b w:val="0"/>
+                <w:sz w:val="14"/>
+              </w:rPr>
+              <w:t>6, 8, 9, 10, 13</w:t>
+            </w:r>
+          </w:p>
+        </w:tc>
+        <w:tc>
+          <w:tcPr>
+            <w:tcW w:type="dxa" w:w="2880"/>
+            <w:vAlign w:val="center"/>
+          </w:tcPr>
+          <w:p>
+            <w:pPr>
+              <w:spacing w:before="0" w:after="0" w:line="240" w:lineRule="auto"/>
+            </w:pPr>
+            <w:r/>
+            <w:r>
+              <w:rPr>
+                <w:b w:val="0"/>
+                <w:sz w:val="14"/>
+              </w:rPr>
+              <w:t>11, 12, 14, 15, 16</w:t>
+            </w:r>
+          </w:p>
+        </w:tc>
+      </w:tr>
+      <w:tr>
+        <w:tc>
+          <w:tcPr>
+            <w:tcW w:type="dxa" w:w="1440"/>
+            <w:vAlign w:val="center"/>
+          </w:tcPr>
+          <w:p>
+            <w:pPr>
+              <w:spacing w:before="0" w:after="0" w:line="240" w:lineRule="auto"/>
+            </w:pPr>
+            <w:r/>
+            <w:r>
+              <w:rPr>
+                <w:b w:val="0"/>
+                <w:sz w:val="14"/>
+              </w:rPr>
+              <w:t>3</w:t>
+            </w:r>
+          </w:p>
+        </w:tc>
+        <w:tc>
+          <w:tcPr>
+            <w:tcW w:type="dxa" w:w="2880"/>
+            <w:vAlign w:val="center"/>
+          </w:tcPr>
+          <w:p>
+            <w:pPr>
+              <w:spacing w:before="0" w:after="0" w:line="240" w:lineRule="auto"/>
+            </w:pPr>
+            <w:r/>
+            <w:r>
+              <w:rPr>
+                <w:b w:val="0"/>
+                <w:sz w:val="14"/>
+              </w:rPr>
+              <w:t>1, 2, 3, 4, 5, 10</w:t>
+            </w:r>
+          </w:p>
+        </w:tc>
+        <w:tc>
+          <w:tcPr>
+            <w:tcW w:type="dxa" w:w="2880"/>
+            <w:vAlign w:val="center"/>
+          </w:tcPr>
+          <w:p>
+            <w:pPr>
+              <w:spacing w:before="0" w:after="0" w:line="240" w:lineRule="auto"/>
+            </w:pPr>
+            <w:r/>
+            <w:r>
+              <w:rPr>
+                <w:b w:val="0"/>
+                <w:sz w:val="14"/>
+              </w:rPr>
+              <w:t>7, 8, 9, 13, 16</w:t>
+            </w:r>
+          </w:p>
+        </w:tc>
+        <w:tc>
+          <w:tcPr>
+            <w:tcW w:type="dxa" w:w="2880"/>
+            <w:vAlign w:val="center"/>
+          </w:tcPr>
+          <w:p>
+            <w:pPr>
+              <w:spacing w:before="0" w:after="0" w:line="240" w:lineRule="auto"/>
+            </w:pPr>
+            <w:r/>
+            <w:r>
+              <w:rPr>
+                <w:b w:val="0"/>
+                <w:sz w:val="14"/>
+              </w:rPr>
+              <w:t>6, 11, 12, 14, 15</w:t>
+            </w:r>
+          </w:p>
+        </w:tc>
+      </w:tr>
+    </w:tbl>
+    <w:p>
+      <w:r>
+        <w:t>Table S2b. Fold-local class-frequency tiers used by the outer evaluators. Each mapping is derived deterministically from that fold's outer-training image frequencies; the tier labels are not imported from a single development split.</w:t>
+      </w:r>
+    </w:p>
     <w:p>
       <w:pPr>
         <w:pStyle w:val="Heading1"/>
@@ -3835,7 +4166,7 @@
         <w:pStyle w:val="ListBullet"/>
       </w:pPr>
       <w:r>
-        <w:t>Donor-realization, F0-2RGB, donor-subject-suppressed, group-weighted, and MobileNet analyses: post-hoc or boundary evidence; not independent validation.</w:t>
+        <w:t>Donor-realization, F0-2RGB, donor-subject-suppressed, group-weighted, and MobileNet analyses: post-hoc validity or boundary evidence; not independent validation.</w:t>
       </w:r>
     </w:p>
     <w:p>

</xml_diff>